<commit_message>
Add Section 12 (Repository Documentation) to v5 Word doc
Co-Authored-By: Claude Sonnet 4.6 <noreply@anthropic.com>
</commit_message>
<xml_diff>
--- a/SQL/FindTeamByBlockTypeAndWorkflow_v5_Documentation.docx
+++ b/SQL/FindTeamByBlockTypeAndWorkflow_v5_Documentation.docx
@@ -1914,6 +1914,178 @@
         <w:t>The app runs at http://localhost:3000. Source code is at https://github.com/gsecrest/workflow-query-app.</w:t>
       </w:r>
     </w:p>
+    <w:p>
+      <w:pPr>
+        <w:pStyle w:val="Heading1"/>
+      </w:pPr>
+      <w:r>
+        <w:t>12. Repository Documentation</w:t>
+      </w:r>
+    </w:p>
+    <w:p>
+      <w:pPr/>
+      <w:r>
+        <w:t>The ivanti-workflow-tools GitHub repository (https://github.com/gsecrest/ivanti-workflow-tools) contains three README files that document the project at different levels of detail.</w:t>
+      </w:r>
+    </w:p>
+    <w:p>
+      <w:pPr>
+        <w:pStyle w:val="Heading2"/>
+      </w:pPr>
+      <w:r>
+        <w:t>12.1 Root README</w:t>
+      </w:r>
+    </w:p>
+    <w:p>
+      <w:pPr/>
+      <w:r>
+        <w:t>Located at the repository root, the root README provides a high-level overview of the entire project. It covers:</w:t>
+      </w:r>
+    </w:p>
+    <w:p>
+      <w:pPr>
+        <w:pStyle w:val="ListBullet"/>
+      </w:pPr>
+      <w:r>
+        <w:t>Repository folder structure (SQL scripts and workflow-query-app)</w:t>
+      </w:r>
+    </w:p>
+    <w:p>
+      <w:pPr>
+        <w:pStyle w:val="ListBullet"/>
+      </w:pPr>
+      <w:r>
+        <w:t>A summary of the primary v5 script including parameters and output columns</w:t>
+      </w:r>
+    </w:p>
+    <w:p>
+      <w:pPr>
+        <w:pStyle w:val="ListBullet"/>
+      </w:pPr>
+      <w:r>
+        <w:t>A table of all supporting SQL scripts and their purpose</w:t>
+      </w:r>
+    </w:p>
+    <w:p>
+      <w:pPr>
+        <w:pStyle w:val="ListBullet"/>
+      </w:pPr>
+      <w:r>
+        <w:t>An overview of the web app with links to its own documentation</w:t>
+      </w:r>
+    </w:p>
+    <w:p>
+      <w:pPr>
+        <w:pStyle w:val="ListBullet"/>
+      </w:pPr>
+      <w:r>
+        <w:t>SQL Server version requirements and database permissions needed</w:t>
+      </w:r>
+    </w:p>
+    <w:p>
+      <w:pPr>
+        <w:pStyle w:val="Heading2"/>
+      </w:pPr>
+      <w:r>
+        <w:t>12.2 SQL Folder README</w:t>
+      </w:r>
+    </w:p>
+    <w:p>
+      <w:pPr/>
+      <w:r>
+        <w:t>Located at SQL/README.md, this README is a detailed reference for every script in the SQL folder. It covers:</w:t>
+      </w:r>
+    </w:p>
+    <w:p>
+      <w:pPr>
+        <w:pStyle w:val="ListBullet"/>
+      </w:pPr>
+      <w:r>
+        <w:t>The primary v5 script with parameter reference and output column descriptions</w:t>
+      </w:r>
+    </w:p>
+    <w:p>
+      <w:pPr>
+        <w:pStyle w:val="ListBullet"/>
+      </w:pPr>
+      <w:r>
+        <w:t>Version history table for v1 through v6 with links to the v4 and v5 Word documentation files</w:t>
+      </w:r>
+    </w:p>
+    <w:p>
+      <w:pPr>
+        <w:pStyle w:val="ListBullet"/>
+      </w:pPr>
+      <w:r>
+        <w:t>All supporting scripts grouped by category: search &amp; discovery, block type analysis, diagnostics &amp; troubleshooting, and schema exploration</w:t>
+      </w:r>
+    </w:p>
+    <w:p>
+      <w:pPr>
+        <w:pStyle w:val="ListBullet"/>
+      </w:pPr>
+      <w:r>
+        <w:t>The Python documentation generator scripts (generate_doc.py, generate_doc_v5.py)</w:t>
+      </w:r>
+    </w:p>
+    <w:p>
+      <w:pPr>
+        <w:pStyle w:val="ListBullet"/>
+      </w:pPr>
+      <w:r>
+        <w:t>A full table of database tables referenced and their purpose</w:t>
+      </w:r>
+    </w:p>
+    <w:p>
+      <w:pPr>
+        <w:pStyle w:val="ListBullet"/>
+      </w:pPr>
+      <w:r>
+        <w:t>SQL Server requirements and access prerequisites</w:t>
+      </w:r>
+    </w:p>
+    <w:p>
+      <w:pPr>
+        <w:pStyle w:val="Heading2"/>
+      </w:pPr>
+      <w:r>
+        <w:t>12.3 Web App Documentation</w:t>
+      </w:r>
+    </w:p>
+    <w:p>
+      <w:pPr/>
+      <w:r>
+        <w:t>The workflow-query-app subfolder contains two documentation files:</w:t>
+      </w:r>
+    </w:p>
+    <w:p>
+      <w:pPr>
+        <w:pStyle w:val="ListBullet"/>
+      </w:pPr>
+      <w:r>
+        <w:rPr>
+          <w:b/>
+        </w:rPr>
+        <w:t>workflow-query-app/README.md</w:t>
+      </w:r>
+      <w:r>
+        <w:t xml:space="preserve"> — User-facing documentation covering what the app does, setup instructions, API route reference, and project structure. Also available in the standalone repository at https://github.com/gsecrest/workflow-query-app.</w:t>
+      </w:r>
+    </w:p>
+    <w:p>
+      <w:pPr>
+        <w:pStyle w:val="ListBullet"/>
+      </w:pPr>
+      <w:r>
+        <w:rPr>
+          <w:b/>
+        </w:rPr>
+        <w:t>workflow-query-app/BUILDING.md</w:t>
+      </w:r>
+      <w:r>
+        <w:t xml:space="preserve"> — Step-by-step guide for building the app from scratch, covering each file, implementation decisions, the SQL query stages, input styling, CSV export, and Copy to Clipboard.</w:t>
+      </w:r>
+    </w:p>
     <w:sectPr>
       <w:pgSz w:w="12240" w:h="15840"/>
       <w:pgMar w:top="1440" w:right="1800" w:bottom="1440" w:left="1800" w:header="720" w:footer="720" w:gutter="0"/>

</xml_diff>

<commit_message>
Expand Section 12.2 with full SQL folder README content
Co-Authored-By: Claude Sonnet 4.6 <noreply@anthropic.com>
</commit_message>
<xml_diff>
--- a/SQL/FindTeamByBlockTypeAndWorkflow_v5_Documentation.docx
+++ b/SQL/FindTeamByBlockTypeAndWorkflow_v5_Documentation.docx
@@ -1993,7 +1993,1917 @@
     <w:p>
       <w:pPr/>
       <w:r>
-        <w:t>Located at SQL/README.md, this README is a detailed reference for every script in the SQL folder. It covers:</w:t>
+        <w:t>Located at SQL/README.md, this README is a detailed reference for every script in the SQL folder.</w:t>
+      </w:r>
+    </w:p>
+    <w:p>
+      <w:pPr>
+        <w:pStyle w:val="Heading2"/>
+      </w:pPr>
+      <w:r>
+        <w:t>Primary Script</w:t>
+      </w:r>
+    </w:p>
+    <w:p>
+      <w:pPr/>
+      <w:r>
+        <w:t>FindTeamByBlockTypeAndWorkflow_v5.sql is the recommended script. It returns all workflow blocks and their assigned teams, with filtering by workflow name, block type, team, and offering status.</w:t>
+      </w:r>
+    </w:p>
+    <w:p>
+      <w:pPr/>
+      <w:r>
+        <w:t>Parameters — edit the four DECLARE statements at the top:</w:t>
+      </w:r>
+    </w:p>
+    <w:p>
+      <w:pPr>
+        <w:shd w:val="clear" w:color="auto" w:fill="F2F2F2"/>
+      </w:pPr>
+      <w:r>
+        <w:rPr>
+          <w:rFonts w:ascii="Courier New" w:hAnsi="Courier New"/>
+          <w:sz w:val="18"/>
+        </w:rPr>
+        <w:t>DECLARE @WorkflowName NVARCHAR(255) = '';                   -- blank = all workflows</w:t>
+        <w:br/>
+        <w:t>DECLARE @BlockType    NVARCHAR(50)  = '';                   -- blank = all block types</w:t>
+        <w:br/>
+        <w:t>DECLARE @TeamName     NVARCHAR(255) = 'Risk Management Support';</w:t>
+        <w:br/>
+        <w:t>DECLARE @Status       NVARCHAR(50)  = 'Published';</w:t>
+      </w:r>
+    </w:p>
+    <w:p>
+      <w:pPr/>
+      <w:r>
+        <w:t>Output columns:</w:t>
+      </w:r>
+    </w:p>
+    <w:tbl>
+      <w:tblPr>
+        <w:tblStyle w:val="TableGrid"/>
+        <w:tblW w:type="auto" w:w="0"/>
+        <w:tblLook w:firstColumn="1" w:firstRow="1" w:lastColumn="0" w:lastRow="0" w:noHBand="0" w:noVBand="1" w:val="04A0"/>
+      </w:tblPr>
+      <w:tblGrid>
+        <w:gridCol w:w="4320"/>
+        <w:gridCol w:w="4320"/>
+      </w:tblGrid>
+      <w:tr>
+        <w:tc>
+          <w:tcPr>
+            <w:tcW w:type="dxa" w:w="4320"/>
+          </w:tcPr>
+          <w:p>
+            <w:r>
+              <w:rPr>
+                <w:b/>
+              </w:rPr>
+              <w:t>Column</w:t>
+            </w:r>
+          </w:p>
+        </w:tc>
+        <w:tc>
+          <w:tcPr>
+            <w:tcW w:type="dxa" w:w="4320"/>
+          </w:tcPr>
+          <w:p>
+            <w:r>
+              <w:rPr>
+                <w:b/>
+              </w:rPr>
+              <w:t>Description</w:t>
+            </w:r>
+          </w:p>
+        </w:tc>
+      </w:tr>
+      <w:tr>
+        <w:tc>
+          <w:tcPr>
+            <w:tcW w:type="dxa" w:w="4320"/>
+          </w:tcPr>
+          <w:p/>
+        </w:tc>
+        <w:tc>
+          <w:tcPr>
+            <w:tcW w:type="dxa" w:w="4320"/>
+          </w:tcPr>
+          <w:p/>
+        </w:tc>
+      </w:tr>
+      <w:tr>
+        <w:tc>
+          <w:tcPr>
+            <w:tcW w:type="dxa" w:w="4320"/>
+          </w:tcPr>
+          <w:p/>
+        </w:tc>
+        <w:tc>
+          <w:tcPr>
+            <w:tcW w:type="dxa" w:w="4320"/>
+          </w:tcPr>
+          <w:p/>
+        </w:tc>
+      </w:tr>
+      <w:tr>
+        <w:tc>
+          <w:tcPr>
+            <w:tcW w:type="dxa" w:w="4320"/>
+          </w:tcPr>
+          <w:p/>
+        </w:tc>
+        <w:tc>
+          <w:tcPr>
+            <w:tcW w:type="dxa" w:w="4320"/>
+          </w:tcPr>
+          <w:p/>
+        </w:tc>
+      </w:tr>
+      <w:tr>
+        <w:tc>
+          <w:tcPr>
+            <w:tcW w:type="dxa" w:w="4320"/>
+          </w:tcPr>
+          <w:p/>
+        </w:tc>
+        <w:tc>
+          <w:tcPr>
+            <w:tcW w:type="dxa" w:w="4320"/>
+          </w:tcPr>
+          <w:p/>
+        </w:tc>
+      </w:tr>
+      <w:tr>
+        <w:tc>
+          <w:tcPr>
+            <w:tcW w:type="dxa" w:w="4320"/>
+          </w:tcPr>
+          <w:p/>
+        </w:tc>
+        <w:tc>
+          <w:tcPr>
+            <w:tcW w:type="dxa" w:w="4320"/>
+          </w:tcPr>
+          <w:p/>
+        </w:tc>
+      </w:tr>
+      <w:tr>
+        <w:tc>
+          <w:tcPr>
+            <w:tcW w:type="dxa" w:w="4320"/>
+          </w:tcPr>
+          <w:p/>
+        </w:tc>
+        <w:tc>
+          <w:tcPr>
+            <w:tcW w:type="dxa" w:w="4320"/>
+          </w:tcPr>
+          <w:p/>
+        </w:tc>
+      </w:tr>
+      <w:tr>
+        <w:tc>
+          <w:tcPr>
+            <w:tcW w:type="dxa" w:w="4320"/>
+          </w:tcPr>
+          <w:p>
+            <w:r>
+              <w:t>WorkflowName</w:t>
+            </w:r>
+          </w:p>
+        </w:tc>
+        <w:tc>
+          <w:tcPr>
+            <w:tcW w:type="dxa" w:w="4320"/>
+          </w:tcPr>
+          <w:p>
+            <w:r>
+              <w:t>Workflow name</w:t>
+            </w:r>
+          </w:p>
+        </w:tc>
+      </w:tr>
+      <w:tr>
+        <w:tc>
+          <w:tcPr>
+            <w:tcW w:type="dxa" w:w="4320"/>
+          </w:tcPr>
+          <w:p>
+            <w:r>
+              <w:t>DefVersion</w:t>
+            </w:r>
+          </w:p>
+        </w:tc>
+        <w:tc>
+          <w:tcPr>
+            <w:tcW w:type="dxa" w:w="4320"/>
+          </w:tcPr>
+          <w:p>
+            <w:r>
+              <w:t>Latest version number</w:t>
+            </w:r>
+          </w:p>
+        </w:tc>
+      </w:tr>
+      <w:tr>
+        <w:tc>
+          <w:tcPr>
+            <w:tcW w:type="dxa" w:w="4320"/>
+          </w:tcPr>
+          <w:p>
+            <w:r>
+              <w:t>RequestOfferingStatus</w:t>
+            </w:r>
+          </w:p>
+        </w:tc>
+        <w:tc>
+          <w:tcPr>
+            <w:tcW w:type="dxa" w:w="4320"/>
+          </w:tcPr>
+          <w:p>
+            <w:r>
+              <w:t>Offering status, or 'No Offering' if unlinked</w:t>
+            </w:r>
+          </w:p>
+        </w:tc>
+      </w:tr>
+      <w:tr>
+        <w:tc>
+          <w:tcPr>
+            <w:tcW w:type="dxa" w:w="4320"/>
+          </w:tcPr>
+          <w:p>
+            <w:r>
+              <w:t>BlockTitle</w:t>
+            </w:r>
+          </w:p>
+        </w:tc>
+        <w:tc>
+          <w:tcPr>
+            <w:tcW w:type="dxa" w:w="4320"/>
+          </w:tcPr>
+          <w:p>
+            <w:r>
+              <w:t>Block display title</w:t>
+            </w:r>
+          </w:p>
+        </w:tc>
+      </w:tr>
+      <w:tr>
+        <w:tc>
+          <w:tcPr>
+            <w:tcW w:type="dxa" w:w="4320"/>
+          </w:tcPr>
+          <w:p>
+            <w:r>
+              <w:t>BlockType</w:t>
+            </w:r>
+          </w:p>
+        </w:tc>
+        <w:tc>
+          <w:tcPr>
+            <w:tcW w:type="dxa" w:w="4320"/>
+          </w:tcPr>
+          <w:p>
+            <w:r>
+              <w:t>task, advancedtask, or update</w:t>
+            </w:r>
+          </w:p>
+        </w:tc>
+      </w:tr>
+      <w:tr>
+        <w:tc>
+          <w:tcPr>
+            <w:tcW w:type="dxa" w:w="4320"/>
+          </w:tcPr>
+          <w:p>
+            <w:r>
+              <w:t>TeamName</w:t>
+            </w:r>
+          </w:p>
+        </w:tc>
+        <w:tc>
+          <w:tcPr>
+            <w:tcW w:type="dxa" w:w="4320"/>
+          </w:tcPr>
+          <w:p>
+            <w:r>
+              <w:t>Team assigned to the block</w:t>
+            </w:r>
+          </w:p>
+        </w:tc>
+      </w:tr>
+    </w:tbl>
+    <w:p>
+      <w:pPr>
+        <w:pStyle w:val="Heading2"/>
+      </w:pPr>
+      <w:r>
+        <w:t>Version History</w:t>
+      </w:r>
+    </w:p>
+    <w:tbl>
+      <w:tblPr>
+        <w:tblStyle w:val="TableGrid"/>
+        <w:tblW w:type="auto" w:w="0"/>
+        <w:tblLook w:firstColumn="1" w:firstRow="1" w:lastColumn="0" w:lastRow="0" w:noHBand="0" w:noVBand="1" w:val="04A0"/>
+      </w:tblPr>
+      <w:tblGrid>
+        <w:gridCol w:w="4320"/>
+        <w:gridCol w:w="4320"/>
+      </w:tblGrid>
+      <w:tr>
+        <w:tc>
+          <w:tcPr>
+            <w:tcW w:type="dxa" w:w="4320"/>
+          </w:tcPr>
+          <w:p>
+            <w:r>
+              <w:rPr>
+                <w:b/>
+              </w:rPr>
+              <w:t>File</w:t>
+            </w:r>
+          </w:p>
+        </w:tc>
+        <w:tc>
+          <w:tcPr>
+            <w:tcW w:type="dxa" w:w="4320"/>
+          </w:tcPr>
+          <w:p>
+            <w:r>
+              <w:rPr>
+                <w:b/>
+              </w:rPr>
+              <w:t>Notes</w:t>
+            </w:r>
+          </w:p>
+        </w:tc>
+      </w:tr>
+      <w:tr>
+        <w:tc>
+          <w:tcPr>
+            <w:tcW w:type="dxa" w:w="4320"/>
+          </w:tcPr>
+          <w:p/>
+        </w:tc>
+        <w:tc>
+          <w:tcPr>
+            <w:tcW w:type="dxa" w:w="4320"/>
+          </w:tcPr>
+          <w:p/>
+        </w:tc>
+      </w:tr>
+      <w:tr>
+        <w:tc>
+          <w:tcPr>
+            <w:tcW w:type="dxa" w:w="4320"/>
+          </w:tcPr>
+          <w:p/>
+        </w:tc>
+        <w:tc>
+          <w:tcPr>
+            <w:tcW w:type="dxa" w:w="4320"/>
+          </w:tcPr>
+          <w:p/>
+        </w:tc>
+      </w:tr>
+      <w:tr>
+        <w:tc>
+          <w:tcPr>
+            <w:tcW w:type="dxa" w:w="4320"/>
+          </w:tcPr>
+          <w:p/>
+        </w:tc>
+        <w:tc>
+          <w:tcPr>
+            <w:tcW w:type="dxa" w:w="4320"/>
+          </w:tcPr>
+          <w:p/>
+        </w:tc>
+      </w:tr>
+      <w:tr>
+        <w:tc>
+          <w:tcPr>
+            <w:tcW w:type="dxa" w:w="4320"/>
+          </w:tcPr>
+          <w:p/>
+        </w:tc>
+        <w:tc>
+          <w:tcPr>
+            <w:tcW w:type="dxa" w:w="4320"/>
+          </w:tcPr>
+          <w:p/>
+        </w:tc>
+      </w:tr>
+      <w:tr>
+        <w:tc>
+          <w:tcPr>
+            <w:tcW w:type="dxa" w:w="4320"/>
+          </w:tcPr>
+          <w:p/>
+        </w:tc>
+        <w:tc>
+          <w:tcPr>
+            <w:tcW w:type="dxa" w:w="4320"/>
+          </w:tcPr>
+          <w:p/>
+        </w:tc>
+      </w:tr>
+      <w:tr>
+        <w:tc>
+          <w:tcPr>
+            <w:tcW w:type="dxa" w:w="4320"/>
+          </w:tcPr>
+          <w:p/>
+        </w:tc>
+        <w:tc>
+          <w:tcPr>
+            <w:tcW w:type="dxa" w:w="4320"/>
+          </w:tcPr>
+          <w:p/>
+        </w:tc>
+      </w:tr>
+      <w:tr>
+        <w:tc>
+          <w:tcPr>
+            <w:tcW w:type="dxa" w:w="4320"/>
+          </w:tcPr>
+          <w:p>
+            <w:r>
+              <w:t>FindTeamByBlockTypeAndWorkflow.sql</w:t>
+            </w:r>
+          </w:p>
+        </w:tc>
+        <w:tc>
+          <w:tcPr>
+            <w:tcW w:type="dxa" w:w="4320"/>
+          </w:tcPr>
+          <w:p>
+            <w:r>
+              <w:t>v1 — initial version</w:t>
+            </w:r>
+          </w:p>
+        </w:tc>
+      </w:tr>
+      <w:tr>
+        <w:tc>
+          <w:tcPr>
+            <w:tcW w:type="dxa" w:w="4320"/>
+          </w:tcPr>
+          <w:p>
+            <w:r>
+              <w:t>FindTeamByBlockTypeAndWorkflow_v2.sql</w:t>
+            </w:r>
+          </w:p>
+        </w:tc>
+        <w:tc>
+          <w:tcPr>
+            <w:tcW w:type="dxa" w:w="4320"/>
+          </w:tcPr>
+          <w:p>
+            <w:r>
+              <w:t>v2</w:t>
+            </w:r>
+          </w:p>
+        </w:tc>
+      </w:tr>
+      <w:tr>
+        <w:tc>
+          <w:tcPr>
+            <w:tcW w:type="dxa" w:w="4320"/>
+          </w:tcPr>
+          <w:p>
+            <w:r>
+              <w:t>FindTeamByBlockTypeAndWorkflow_v3.sql</w:t>
+            </w:r>
+          </w:p>
+        </w:tc>
+        <w:tc>
+          <w:tcPr>
+            <w:tcW w:type="dxa" w:w="4320"/>
+          </w:tcPr>
+          <w:p>
+            <w:r>
+              <w:t>v3</w:t>
+            </w:r>
+          </w:p>
+        </w:tc>
+      </w:tr>
+      <w:tr>
+        <w:tc>
+          <w:tcPr>
+            <w:tcW w:type="dxa" w:w="4320"/>
+          </w:tcPr>
+          <w:p>
+            <w:r>
+              <w:t>FindTeamByBlockTypeAndWorkflow_v4.sql</w:t>
+            </w:r>
+          </w:p>
+        </w:tc>
+        <w:tc>
+          <w:tcPr>
+            <w:tcW w:type="dxa" w:w="4320"/>
+          </w:tcPr>
+          <w:p>
+            <w:r>
+              <w:t>v4 — see v4 documentation</w:t>
+            </w:r>
+          </w:p>
+        </w:tc>
+      </w:tr>
+      <w:tr>
+        <w:tc>
+          <w:tcPr>
+            <w:tcW w:type="dxa" w:w="4320"/>
+          </w:tcPr>
+          <w:p>
+            <w:r>
+              <w:t>FindTeamByBlockTypeAndWorkflow_v5.sql</w:t>
+            </w:r>
+          </w:p>
+        </w:tc>
+        <w:tc>
+          <w:tcPr>
+            <w:tcW w:type="dxa" w:w="4320"/>
+          </w:tcPr>
+          <w:p>
+            <w:r>
+              <w:t>v5 — performance-optimised rewrite; same output as v4</w:t>
+            </w:r>
+          </w:p>
+        </w:tc>
+      </w:tr>
+      <w:tr>
+        <w:tc>
+          <w:tcPr>
+            <w:tcW w:type="dxa" w:w="4320"/>
+          </w:tcPr>
+          <w:p>
+            <w:r>
+              <w:t>FindTeamByBlockTypeAndWorkflow_v6.sql</w:t>
+            </w:r>
+          </w:p>
+        </w:tc>
+        <w:tc>
+          <w:tcPr>
+            <w:tcW w:type="dxa" w:w="4320"/>
+          </w:tcPr>
+          <w:p>
+            <w:r>
+              <w:t>v6</w:t>
+            </w:r>
+          </w:p>
+        </w:tc>
+      </w:tr>
+    </w:tbl>
+    <w:p>
+      <w:pPr/>
+      <w:r>
+        <w:t>Word documentation is available for v4 and v5 in this folder.</w:t>
+      </w:r>
+    </w:p>
+    <w:p>
+      <w:pPr>
+        <w:pStyle w:val="Heading2"/>
+      </w:pPr>
+      <w:r>
+        <w:t>Supporting Scripts</w:t>
+      </w:r>
+    </w:p>
+    <w:p>
+      <w:pPr>
+        <w:pStyle w:val="Heading2"/>
+      </w:pPr>
+      <w:r>
+        <w:t>Search &amp; Discovery</w:t>
+      </w:r>
+    </w:p>
+    <w:tbl>
+      <w:tblPr>
+        <w:tblStyle w:val="TableGrid"/>
+        <w:tblW w:type="auto" w:w="0"/>
+        <w:tblLook w:firstColumn="1" w:firstRow="1" w:lastColumn="0" w:lastRow="0" w:noHBand="0" w:noVBand="1" w:val="04A0"/>
+      </w:tblPr>
+      <w:tblGrid>
+        <w:gridCol w:w="4320"/>
+        <w:gridCol w:w="4320"/>
+      </w:tblGrid>
+      <w:tr>
+        <w:tc>
+          <w:tcPr>
+            <w:tcW w:type="dxa" w:w="4320"/>
+          </w:tcPr>
+          <w:p>
+            <w:r>
+              <w:rPr>
+                <w:b/>
+              </w:rPr>
+              <w:t>Script</w:t>
+            </w:r>
+          </w:p>
+        </w:tc>
+        <w:tc>
+          <w:tcPr>
+            <w:tcW w:type="dxa" w:w="4320"/>
+          </w:tcPr>
+          <w:p>
+            <w:r>
+              <w:rPr>
+                <w:b/>
+              </w:rPr>
+              <w:t>Description</w:t>
+            </w:r>
+          </w:p>
+        </w:tc>
+      </w:tr>
+      <w:tr>
+        <w:tc>
+          <w:tcPr>
+            <w:tcW w:type="dxa" w:w="4320"/>
+          </w:tcPr>
+          <w:p/>
+        </w:tc>
+        <w:tc>
+          <w:tcPr>
+            <w:tcW w:type="dxa" w:w="4320"/>
+          </w:tcPr>
+          <w:p/>
+        </w:tc>
+      </w:tr>
+      <w:tr>
+        <w:tc>
+          <w:tcPr>
+            <w:tcW w:type="dxa" w:w="4320"/>
+          </w:tcPr>
+          <w:p/>
+        </w:tc>
+        <w:tc>
+          <w:tcPr>
+            <w:tcW w:type="dxa" w:w="4320"/>
+          </w:tcPr>
+          <w:p/>
+        </w:tc>
+      </w:tr>
+      <w:tr>
+        <w:tc>
+          <w:tcPr>
+            <w:tcW w:type="dxa" w:w="4320"/>
+          </w:tcPr>
+          <w:p/>
+        </w:tc>
+        <w:tc>
+          <w:tcPr>
+            <w:tcW w:type="dxa" w:w="4320"/>
+          </w:tcPr>
+          <w:p/>
+        </w:tc>
+      </w:tr>
+      <w:tr>
+        <w:tc>
+          <w:tcPr>
+            <w:tcW w:type="dxa" w:w="4320"/>
+          </w:tcPr>
+          <w:p/>
+        </w:tc>
+        <w:tc>
+          <w:tcPr>
+            <w:tcW w:type="dxa" w:w="4320"/>
+          </w:tcPr>
+          <w:p/>
+        </w:tc>
+      </w:tr>
+      <w:tr>
+        <w:tc>
+          <w:tcPr>
+            <w:tcW w:type="dxa" w:w="4320"/>
+          </w:tcPr>
+          <w:p/>
+        </w:tc>
+        <w:tc>
+          <w:tcPr>
+            <w:tcW w:type="dxa" w:w="4320"/>
+          </w:tcPr>
+          <w:p/>
+        </w:tc>
+      </w:tr>
+      <w:tr>
+        <w:tc>
+          <w:tcPr>
+            <w:tcW w:type="dxa" w:w="4320"/>
+          </w:tcPr>
+          <w:p/>
+        </w:tc>
+        <w:tc>
+          <w:tcPr>
+            <w:tcW w:type="dxa" w:w="4320"/>
+          </w:tcPr>
+          <w:p/>
+        </w:tc>
+      </w:tr>
+      <w:tr>
+        <w:tc>
+          <w:tcPr>
+            <w:tcW w:type="dxa" w:w="4320"/>
+          </w:tcPr>
+          <w:p/>
+        </w:tc>
+        <w:tc>
+          <w:tcPr>
+            <w:tcW w:type="dxa" w:w="4320"/>
+          </w:tcPr>
+          <w:p/>
+        </w:tc>
+      </w:tr>
+      <w:tr>
+        <w:tc>
+          <w:tcPr>
+            <w:tcW w:type="dxa" w:w="4320"/>
+          </w:tcPr>
+          <w:p>
+            <w:r>
+              <w:t>FindWorkflowsByTeamAndBlockType.sql</w:t>
+            </w:r>
+          </w:p>
+        </w:tc>
+        <w:tc>
+          <w:tcPr>
+            <w:tcW w:type="dxa" w:w="4320"/>
+          </w:tcPr>
+          <w:p>
+            <w:r>
+              <w:t>Find workflows containing blocks for a given team and block type</w:t>
+            </w:r>
+          </w:p>
+        </w:tc>
+      </w:tr>
+      <w:tr>
+        <w:tc>
+          <w:tcPr>
+            <w:tcW w:type="dxa" w:w="4320"/>
+          </w:tcPr>
+          <w:p>
+            <w:r>
+              <w:t>FindWorkflowsByTeamAndBlockType_v2.sql</w:t>
+            </w:r>
+          </w:p>
+        </w:tc>
+        <w:tc>
+          <w:tcPr>
+            <w:tcW w:type="dxa" w:w="4320"/>
+          </w:tcPr>
+          <w:p>
+            <w:r>
+              <w:t>Updated version</w:t>
+            </w:r>
+          </w:p>
+        </w:tc>
+      </w:tr>
+      <w:tr>
+        <w:tc>
+          <w:tcPr>
+            <w:tcW w:type="dxa" w:w="4320"/>
+          </w:tcPr>
+          <w:p>
+            <w:r>
+              <w:t>FindWorkflowsByTeamName.sql</w:t>
+            </w:r>
+          </w:p>
+        </w:tc>
+        <w:tc>
+          <w:tcPr>
+            <w:tcW w:type="dxa" w:w="4320"/>
+          </w:tcPr>
+          <w:p>
+            <w:r>
+              <w:t>Find all workflows referencing a specific team</w:t>
+            </w:r>
+          </w:p>
+        </w:tc>
+      </w:tr>
+      <w:tr>
+        <w:tc>
+          <w:tcPr>
+            <w:tcW w:type="dxa" w:w="4320"/>
+          </w:tcPr>
+          <w:p>
+            <w:r>
+              <w:t>FindWorkflowsByTeamName_v2.sql</w:t>
+            </w:r>
+          </w:p>
+        </w:tc>
+        <w:tc>
+          <w:tcPr>
+            <w:tcW w:type="dxa" w:w="4320"/>
+          </w:tcPr>
+          <w:p>
+            <w:r>
+              <w:t>Updated version</w:t>
+            </w:r>
+          </w:p>
+        </w:tc>
+      </w:tr>
+      <w:tr>
+        <w:tc>
+          <w:tcPr>
+            <w:tcW w:type="dxa" w:w="4320"/>
+          </w:tcPr>
+          <w:p>
+            <w:r>
+              <w:t>FindTeamByRO.sql</w:t>
+            </w:r>
+          </w:p>
+        </w:tc>
+        <w:tc>
+          <w:tcPr>
+            <w:tcW w:type="dxa" w:w="4320"/>
+          </w:tcPr>
+          <w:p>
+            <w:r>
+              <w:t>Find teams by request offering</w:t>
+            </w:r>
+          </w:p>
+        </w:tc>
+      </w:tr>
+      <w:tr>
+        <w:tc>
+          <w:tcPr>
+            <w:tcW w:type="dxa" w:w="4320"/>
+          </w:tcPr>
+          <w:p>
+            <w:r>
+              <w:t>FindROByTeam2min.sql</w:t>
+            </w:r>
+          </w:p>
+        </w:tc>
+        <w:tc>
+          <w:tcPr>
+            <w:tcW w:type="dxa" w:w="4320"/>
+          </w:tcPr>
+          <w:p>
+            <w:r>
+              <w:t>Find request offerings by team (optimised)</w:t>
+            </w:r>
+          </w:p>
+        </w:tc>
+      </w:tr>
+      <w:tr>
+        <w:tc>
+          <w:tcPr>
+            <w:tcW w:type="dxa" w:w="4320"/>
+          </w:tcPr>
+          <w:p>
+            <w:r>
+              <w:t>FinalFindTeamInRO.sql</w:t>
+            </w:r>
+          </w:p>
+        </w:tc>
+        <w:tc>
+          <w:tcPr>
+            <w:tcW w:type="dxa" w:w="4320"/>
+          </w:tcPr>
+          <w:p>
+            <w:r>
+              <w:t>Find team assignments in request offerings</w:t>
+            </w:r>
+          </w:p>
+        </w:tc>
+      </w:tr>
+    </w:tbl>
+    <w:p>
+      <w:pPr>
+        <w:pStyle w:val="Heading2"/>
+      </w:pPr>
+      <w:r>
+        <w:t>Block Type Analysis</w:t>
+      </w:r>
+    </w:p>
+    <w:tbl>
+      <w:tblPr>
+        <w:tblStyle w:val="TableGrid"/>
+        <w:tblW w:type="auto" w:w="0"/>
+        <w:tblLook w:firstColumn="1" w:firstRow="1" w:lastColumn="0" w:lastRow="0" w:noHBand="0" w:noVBand="1" w:val="04A0"/>
+      </w:tblPr>
+      <w:tblGrid>
+        <w:gridCol w:w="4320"/>
+        <w:gridCol w:w="4320"/>
+      </w:tblGrid>
+      <w:tr>
+        <w:tc>
+          <w:tcPr>
+            <w:tcW w:type="dxa" w:w="4320"/>
+          </w:tcPr>
+          <w:p>
+            <w:r>
+              <w:rPr>
+                <w:b/>
+              </w:rPr>
+              <w:t>Script</w:t>
+            </w:r>
+          </w:p>
+        </w:tc>
+        <w:tc>
+          <w:tcPr>
+            <w:tcW w:type="dxa" w:w="4320"/>
+          </w:tcPr>
+          <w:p>
+            <w:r>
+              <w:rPr>
+                <w:b/>
+              </w:rPr>
+              <w:t>Description</w:t>
+            </w:r>
+          </w:p>
+        </w:tc>
+      </w:tr>
+      <w:tr>
+        <w:tc>
+          <w:tcPr>
+            <w:tcW w:type="dxa" w:w="4320"/>
+          </w:tcPr>
+          <w:p/>
+        </w:tc>
+        <w:tc>
+          <w:tcPr>
+            <w:tcW w:type="dxa" w:w="4320"/>
+          </w:tcPr>
+          <w:p/>
+        </w:tc>
+      </w:tr>
+      <w:tr>
+        <w:tc>
+          <w:tcPr>
+            <w:tcW w:type="dxa" w:w="4320"/>
+          </w:tcPr>
+          <w:p/>
+        </w:tc>
+        <w:tc>
+          <w:tcPr>
+            <w:tcW w:type="dxa" w:w="4320"/>
+          </w:tcPr>
+          <w:p/>
+        </w:tc>
+      </w:tr>
+      <w:tr>
+        <w:tc>
+          <w:tcPr>
+            <w:tcW w:type="dxa" w:w="4320"/>
+          </w:tcPr>
+          <w:p/>
+        </w:tc>
+        <w:tc>
+          <w:tcPr>
+            <w:tcW w:type="dxa" w:w="4320"/>
+          </w:tcPr>
+          <w:p/>
+        </w:tc>
+      </w:tr>
+      <w:tr>
+        <w:tc>
+          <w:tcPr>
+            <w:tcW w:type="dxa" w:w="4320"/>
+          </w:tcPr>
+          <w:p/>
+        </w:tc>
+        <w:tc>
+          <w:tcPr>
+            <w:tcW w:type="dxa" w:w="4320"/>
+          </w:tcPr>
+          <w:p/>
+        </w:tc>
+      </w:tr>
+      <w:tr>
+        <w:tc>
+          <w:tcPr>
+            <w:tcW w:type="dxa" w:w="4320"/>
+          </w:tcPr>
+          <w:p/>
+        </w:tc>
+        <w:tc>
+          <w:tcPr>
+            <w:tcW w:type="dxa" w:w="4320"/>
+          </w:tcPr>
+          <w:p/>
+        </w:tc>
+      </w:tr>
+      <w:tr>
+        <w:tc>
+          <w:tcPr>
+            <w:tcW w:type="dxa" w:w="4320"/>
+          </w:tcPr>
+          <w:p>
+            <w:r>
+              <w:t>GetAllBlockTypes.sql</w:t>
+            </w:r>
+          </w:p>
+        </w:tc>
+        <w:tc>
+          <w:tcPr>
+            <w:tcW w:type="dxa" w:w="4320"/>
+          </w:tcPr>
+          <w:p>
+            <w:r>
+              <w:t>List all distinct block types across all workflows</w:t>
+            </w:r>
+          </w:p>
+        </w:tc>
+      </w:tr>
+      <w:tr>
+        <w:tc>
+          <w:tcPr>
+            <w:tcW w:type="dxa" w:w="4320"/>
+          </w:tcPr>
+          <w:p>
+            <w:r>
+              <w:t>GetAllBlockTypes_AllWorkflows.sql</w:t>
+            </w:r>
+          </w:p>
+        </w:tc>
+        <w:tc>
+          <w:tcPr>
+            <w:tcW w:type="dxa" w:w="4320"/>
+          </w:tcPr>
+          <w:p>
+            <w:r>
+              <w:t>Block types across all workflows (broader scope)</w:t>
+            </w:r>
+          </w:p>
+        </w:tc>
+      </w:tr>
+      <w:tr>
+        <w:tc>
+          <w:tcPr>
+            <w:tcW w:type="dxa" w:w="4320"/>
+          </w:tcPr>
+          <w:p>
+            <w:r>
+              <w:t>GetAllBlockTypesByTeam.sql</w:t>
+            </w:r>
+          </w:p>
+        </w:tc>
+        <w:tc>
+          <w:tcPr>
+            <w:tcW w:type="dxa" w:w="4320"/>
+          </w:tcPr>
+          <w:p>
+            <w:r>
+              <w:t>Block types grouped by team</w:t>
+            </w:r>
+          </w:p>
+        </w:tc>
+      </w:tr>
+      <w:tr>
+        <w:tc>
+          <w:tcPr>
+            <w:tcW w:type="dxa" w:w="4320"/>
+          </w:tcPr>
+          <w:p>
+            <w:r>
+              <w:t>GetTeamsByBlockType.sql</w:t>
+            </w:r>
+          </w:p>
+        </w:tc>
+        <w:tc>
+          <w:tcPr>
+            <w:tcW w:type="dxa" w:w="4320"/>
+          </w:tcPr>
+          <w:p>
+            <w:r>
+              <w:t>Teams grouped by block type</w:t>
+            </w:r>
+          </w:p>
+        </w:tc>
+      </w:tr>
+      <w:tr>
+        <w:tc>
+          <w:tcPr>
+            <w:tcW w:type="dxa" w:w="4320"/>
+          </w:tcPr>
+          <w:p>
+            <w:r>
+              <w:t>GetTeamsByBlockType_NoExpressions.sql</w:t>
+            </w:r>
+          </w:p>
+        </w:tc>
+        <w:tc>
+          <w:tcPr>
+            <w:tcW w:type="dxa" w:w="4320"/>
+          </w:tcPr>
+          <w:p>
+            <w:r>
+              <w:t>Same, excluding dynamic expression values</w:t>
+            </w:r>
+          </w:p>
+        </w:tc>
+      </w:tr>
+    </w:tbl>
+    <w:p>
+      <w:pPr>
+        <w:pStyle w:val="Heading2"/>
+      </w:pPr>
+      <w:r>
+        <w:t>Diagnostics &amp; Troubleshooting</w:t>
+      </w:r>
+    </w:p>
+    <w:tbl>
+      <w:tblPr>
+        <w:tblStyle w:val="TableGrid"/>
+        <w:tblW w:type="auto" w:w="0"/>
+        <w:tblLook w:firstColumn="1" w:firstRow="1" w:lastColumn="0" w:lastRow="0" w:noHBand="0" w:noVBand="1" w:val="04A0"/>
+      </w:tblPr>
+      <w:tblGrid>
+        <w:gridCol w:w="4320"/>
+        <w:gridCol w:w="4320"/>
+      </w:tblGrid>
+      <w:tr>
+        <w:tc>
+          <w:tcPr>
+            <w:tcW w:type="dxa" w:w="4320"/>
+          </w:tcPr>
+          <w:p>
+            <w:r>
+              <w:rPr>
+                <w:b/>
+              </w:rPr>
+              <w:t>Script</w:t>
+            </w:r>
+          </w:p>
+        </w:tc>
+        <w:tc>
+          <w:tcPr>
+            <w:tcW w:type="dxa" w:w="4320"/>
+          </w:tcPr>
+          <w:p>
+            <w:r>
+              <w:rPr>
+                <w:b/>
+              </w:rPr>
+              <w:t>Description</w:t>
+            </w:r>
+          </w:p>
+        </w:tc>
+      </w:tr>
+      <w:tr>
+        <w:tc>
+          <w:tcPr>
+            <w:tcW w:type="dxa" w:w="4320"/>
+          </w:tcPr>
+          <w:p/>
+        </w:tc>
+        <w:tc>
+          <w:tcPr>
+            <w:tcW w:type="dxa" w:w="4320"/>
+          </w:tcPr>
+          <w:p/>
+        </w:tc>
+      </w:tr>
+      <w:tr>
+        <w:tc>
+          <w:tcPr>
+            <w:tcW w:type="dxa" w:w="4320"/>
+          </w:tcPr>
+          <w:p/>
+        </w:tc>
+        <w:tc>
+          <w:tcPr>
+            <w:tcW w:type="dxa" w:w="4320"/>
+          </w:tcPr>
+          <w:p/>
+        </w:tc>
+      </w:tr>
+      <w:tr>
+        <w:tc>
+          <w:tcPr>
+            <w:tcW w:type="dxa" w:w="4320"/>
+          </w:tcPr>
+          <w:p/>
+        </w:tc>
+        <w:tc>
+          <w:tcPr>
+            <w:tcW w:type="dxa" w:w="4320"/>
+          </w:tcPr>
+          <w:p/>
+        </w:tc>
+      </w:tr>
+      <w:tr>
+        <w:tc>
+          <w:tcPr>
+            <w:tcW w:type="dxa" w:w="4320"/>
+          </w:tcPr>
+          <w:p/>
+        </w:tc>
+        <w:tc>
+          <w:tcPr>
+            <w:tcW w:type="dxa" w:w="4320"/>
+          </w:tcPr>
+          <w:p/>
+        </w:tc>
+      </w:tr>
+      <w:tr>
+        <w:tc>
+          <w:tcPr>
+            <w:tcW w:type="dxa" w:w="4320"/>
+          </w:tcPr>
+          <w:p/>
+        </w:tc>
+        <w:tc>
+          <w:tcPr>
+            <w:tcW w:type="dxa" w:w="4320"/>
+          </w:tcPr>
+          <w:p/>
+        </w:tc>
+      </w:tr>
+      <w:tr>
+        <w:tc>
+          <w:tcPr>
+            <w:tcW w:type="dxa" w:w="4320"/>
+          </w:tcPr>
+          <w:p>
+            <w:r>
+              <w:t>DiagnoseOfferingStatus.sql</w:t>
+            </w:r>
+          </w:p>
+        </w:tc>
+        <w:tc>
+          <w:tcPr>
+            <w:tcW w:type="dxa" w:w="4320"/>
+          </w:tcPr>
+          <w:p>
+            <w:r>
+              <w:t>Troubleshoot offering status join results</w:t>
+            </w:r>
+          </w:p>
+        </w:tc>
+      </w:tr>
+      <w:tr>
+        <w:tc>
+          <w:tcPr>
+            <w:tcW w:type="dxa" w:w="4320"/>
+          </w:tcPr>
+          <w:p>
+            <w:r>
+              <w:t>DiagnoseOfferingStatus_Single.sql</w:t>
+            </w:r>
+          </w:p>
+        </w:tc>
+        <w:tc>
+          <w:tcPr>
+            <w:tcW w:type="dxa" w:w="4320"/>
+          </w:tcPr>
+          <w:p>
+            <w:r>
+              <w:t>Single-workflow offering status diagnosis</w:t>
+            </w:r>
+          </w:p>
+        </w:tc>
+      </w:tr>
+      <w:tr>
+        <w:tc>
+          <w:tcPr>
+            <w:tcW w:type="dxa" w:w="4320"/>
+          </w:tcPr>
+          <w:p>
+            <w:r>
+              <w:t>DiagnoseWorkflowBlocks.sql</w:t>
+            </w:r>
+          </w:p>
+        </w:tc>
+        <w:tc>
+          <w:tcPr>
+            <w:tcW w:type="dxa" w:w="4320"/>
+          </w:tcPr>
+          <w:p>
+            <w:r>
+              <w:t>Inspect raw block data from a specific workflow</w:t>
+            </w:r>
+          </w:p>
+        </w:tc>
+      </w:tr>
+      <w:tr>
+        <w:tc>
+          <w:tcPr>
+            <w:tcW w:type="dxa" w:w="4320"/>
+          </w:tcPr>
+          <w:p>
+            <w:r>
+              <w:t>DiagnoseWorkflowIdFormat.sql</w:t>
+            </w:r>
+          </w:p>
+        </w:tc>
+        <w:tc>
+          <w:tcPr>
+            <w:tcW w:type="dxa" w:w="4320"/>
+          </w:tcPr>
+          <w:p>
+            <w:r>
+              <w:t>Verify workflow ID format for join compatibility</w:t>
+            </w:r>
+          </w:p>
+        </w:tc>
+      </w:tr>
+      <w:tr>
+        <w:tc>
+          <w:tcPr>
+            <w:tcW w:type="dxa" w:w="4320"/>
+          </w:tcPr>
+          <w:p>
+            <w:r>
+              <w:t>InspectTaskBlockProperties.sql</w:t>
+            </w:r>
+          </w:p>
+        </w:tc>
+        <w:tc>
+          <w:tcPr>
+            <w:tcW w:type="dxa" w:w="4320"/>
+          </w:tcPr>
+          <w:p>
+            <w:r>
+              <w:t>Inspect task block XML properties</w:t>
+            </w:r>
+          </w:p>
+        </w:tc>
+      </w:tr>
+    </w:tbl>
+    <w:p>
+      <w:pPr>
+        <w:pStyle w:val="Heading2"/>
+      </w:pPr>
+      <w:r>
+        <w:t>Schema Exploration</w:t>
+      </w:r>
+    </w:p>
+    <w:tbl>
+      <w:tblPr>
+        <w:tblStyle w:val="TableGrid"/>
+        <w:tblW w:type="auto" w:w="0"/>
+        <w:tblLook w:firstColumn="1" w:firstRow="1" w:lastColumn="0" w:lastRow="0" w:noHBand="0" w:noVBand="1" w:val="04A0"/>
+      </w:tblPr>
+      <w:tblGrid>
+        <w:gridCol w:w="4320"/>
+        <w:gridCol w:w="4320"/>
+      </w:tblGrid>
+      <w:tr>
+        <w:tc>
+          <w:tcPr>
+            <w:tcW w:type="dxa" w:w="4320"/>
+          </w:tcPr>
+          <w:p>
+            <w:r>
+              <w:rPr>
+                <w:b/>
+              </w:rPr>
+              <w:t>Script</w:t>
+            </w:r>
+          </w:p>
+        </w:tc>
+        <w:tc>
+          <w:tcPr>
+            <w:tcW w:type="dxa" w:w="4320"/>
+          </w:tcPr>
+          <w:p>
+            <w:r>
+              <w:rPr>
+                <w:b/>
+              </w:rPr>
+              <w:t>Description</w:t>
+            </w:r>
+          </w:p>
+        </w:tc>
+      </w:tr>
+      <w:tr>
+        <w:tc>
+          <w:tcPr>
+            <w:tcW w:type="dxa" w:w="4320"/>
+          </w:tcPr>
+          <w:p/>
+        </w:tc>
+        <w:tc>
+          <w:tcPr>
+            <w:tcW w:type="dxa" w:w="4320"/>
+          </w:tcPr>
+          <w:p/>
+        </w:tc>
+      </w:tr>
+      <w:tr>
+        <w:tc>
+          <w:tcPr>
+            <w:tcW w:type="dxa" w:w="4320"/>
+          </w:tcPr>
+          <w:p/>
+        </w:tc>
+        <w:tc>
+          <w:tcPr>
+            <w:tcW w:type="dxa" w:w="4320"/>
+          </w:tcPr>
+          <w:p/>
+        </w:tc>
+      </w:tr>
+      <w:tr>
+        <w:tc>
+          <w:tcPr>
+            <w:tcW w:type="dxa" w:w="4320"/>
+          </w:tcPr>
+          <w:p/>
+        </w:tc>
+        <w:tc>
+          <w:tcPr>
+            <w:tcW w:type="dxa" w:w="4320"/>
+          </w:tcPr>
+          <w:p/>
+        </w:tc>
+      </w:tr>
+      <w:tr>
+        <w:tc>
+          <w:tcPr>
+            <w:tcW w:type="dxa" w:w="4320"/>
+          </w:tcPr>
+          <w:p>
+            <w:r>
+              <w:t>ExploreFulfillmentPlan.sql</w:t>
+            </w:r>
+          </w:p>
+        </w:tc>
+        <w:tc>
+          <w:tcPr>
+            <w:tcW w:type="dxa" w:w="4320"/>
+          </w:tcPr>
+          <w:p>
+            <w:r>
+              <w:t>Explore the ServiceReqFulfillmentPlan schema</w:t>
+            </w:r>
+          </w:p>
+        </w:tc>
+      </w:tr>
+      <w:tr>
+        <w:tc>
+          <w:tcPr>
+            <w:tcW w:type="dxa" w:w="4320"/>
+          </w:tcPr>
+          <w:p>
+            <w:r>
+              <w:t>ExploreFusionLink.sql</w:t>
+            </w:r>
+          </w:p>
+        </w:tc>
+        <w:tc>
+          <w:tcPr>
+            <w:tcW w:type="dxa" w:w="4320"/>
+          </w:tcPr>
+          <w:p>
+            <w:r>
+              <w:t>Explore the FusionLink relationship table</w:t>
+            </w:r>
+          </w:p>
+        </w:tc>
+      </w:tr>
+      <w:tr>
+        <w:tc>
+          <w:tcPr>
+            <w:tcW w:type="dxa" w:w="4320"/>
+          </w:tcPr>
+          <w:p>
+            <w:r>
+              <w:t>ExploreServiceReqTemplate.sql</w:t>
+            </w:r>
+          </w:p>
+        </w:tc>
+        <w:tc>
+          <w:tcPr>
+            <w:tcW w:type="dxa" w:w="4320"/>
+          </w:tcPr>
+          <w:p>
+            <w:r>
+              <w:t>Explore the ServiceReqTemplate schema</w:t>
+            </w:r>
+          </w:p>
+        </w:tc>
+      </w:tr>
+    </w:tbl>
+    <w:p>
+      <w:pPr>
+        <w:pStyle w:val="Heading2"/>
+      </w:pPr>
+      <w:r>
+        <w:t>Documentation Generators</w:t>
+      </w:r>
+    </w:p>
+    <w:tbl>
+      <w:tblPr>
+        <w:tblStyle w:val="TableGrid"/>
+        <w:tblW w:type="auto" w:w="0"/>
+        <w:tblLook w:firstColumn="1" w:firstRow="1" w:lastColumn="0" w:lastRow="0" w:noHBand="0" w:noVBand="1" w:val="04A0"/>
+      </w:tblPr>
+      <w:tblGrid>
+        <w:gridCol w:w="4320"/>
+        <w:gridCol w:w="4320"/>
+      </w:tblGrid>
+      <w:tr>
+        <w:tc>
+          <w:tcPr>
+            <w:tcW w:type="dxa" w:w="4320"/>
+          </w:tcPr>
+          <w:p>
+            <w:r>
+              <w:rPr>
+                <w:b/>
+              </w:rPr>
+              <w:t>Script</w:t>
+            </w:r>
+          </w:p>
+        </w:tc>
+        <w:tc>
+          <w:tcPr>
+            <w:tcW w:type="dxa" w:w="4320"/>
+          </w:tcPr>
+          <w:p>
+            <w:r>
+              <w:rPr>
+                <w:b/>
+              </w:rPr>
+              <w:t>Description</w:t>
+            </w:r>
+          </w:p>
+        </w:tc>
+      </w:tr>
+      <w:tr>
+        <w:tc>
+          <w:tcPr>
+            <w:tcW w:type="dxa" w:w="4320"/>
+          </w:tcPr>
+          <w:p/>
+        </w:tc>
+        <w:tc>
+          <w:tcPr>
+            <w:tcW w:type="dxa" w:w="4320"/>
+          </w:tcPr>
+          <w:p/>
+        </w:tc>
+      </w:tr>
+      <w:tr>
+        <w:tc>
+          <w:tcPr>
+            <w:tcW w:type="dxa" w:w="4320"/>
+          </w:tcPr>
+          <w:p/>
+        </w:tc>
+        <w:tc>
+          <w:tcPr>
+            <w:tcW w:type="dxa" w:w="4320"/>
+          </w:tcPr>
+          <w:p/>
+        </w:tc>
+      </w:tr>
+      <w:tr>
+        <w:tc>
+          <w:tcPr>
+            <w:tcW w:type="dxa" w:w="4320"/>
+          </w:tcPr>
+          <w:p>
+            <w:r>
+              <w:t>generate_doc.py</w:t>
+            </w:r>
+          </w:p>
+        </w:tc>
+        <w:tc>
+          <w:tcPr>
+            <w:tcW w:type="dxa" w:w="4320"/>
+          </w:tcPr>
+          <w:p>
+            <w:r>
+              <w:t>Python script that generated the v4 Word documentation</w:t>
+            </w:r>
+          </w:p>
+        </w:tc>
+      </w:tr>
+      <w:tr>
+        <w:tc>
+          <w:tcPr>
+            <w:tcW w:type="dxa" w:w="4320"/>
+          </w:tcPr>
+          <w:p>
+            <w:r>
+              <w:t>generate_doc_v5.py</w:t>
+            </w:r>
+          </w:p>
+        </w:tc>
+        <w:tc>
+          <w:tcPr>
+            <w:tcW w:type="dxa" w:w="4320"/>
+          </w:tcPr>
+          <w:p>
+            <w:r>
+              <w:t>Python script that generated the v5 Word documentation</w:t>
+            </w:r>
+          </w:p>
+        </w:tc>
+      </w:tr>
+    </w:tbl>
+    <w:p>
+      <w:pPr>
+        <w:pStyle w:val="Heading2"/>
+      </w:pPr>
+      <w:r>
+        <w:t>Database Tables Referenced</w:t>
+      </w:r>
+    </w:p>
+    <w:tbl>
+      <w:tblPr>
+        <w:tblStyle w:val="TableGrid"/>
+        <w:tblW w:type="auto" w:w="0"/>
+        <w:tblLook w:firstColumn="1" w:firstRow="1" w:lastColumn="0" w:lastRow="0" w:noHBand="0" w:noVBand="1" w:val="04A0"/>
+      </w:tblPr>
+      <w:tblGrid>
+        <w:gridCol w:w="4320"/>
+        <w:gridCol w:w="4320"/>
+      </w:tblGrid>
+      <w:tr>
+        <w:tc>
+          <w:tcPr>
+            <w:tcW w:type="dxa" w:w="4320"/>
+          </w:tcPr>
+          <w:p>
+            <w:r>
+              <w:rPr>
+                <w:b/>
+              </w:rPr>
+              <w:t>Table</w:t>
+            </w:r>
+          </w:p>
+        </w:tc>
+        <w:tc>
+          <w:tcPr>
+            <w:tcW w:type="dxa" w:w="4320"/>
+          </w:tcPr>
+          <w:p>
+            <w:r>
+              <w:rPr>
+                <w:b/>
+              </w:rPr>
+              <w:t>Purpose</w:t>
+            </w:r>
+          </w:p>
+        </w:tc>
+      </w:tr>
+      <w:tr>
+        <w:tc>
+          <w:tcPr>
+            <w:tcW w:type="dxa" w:w="4320"/>
+          </w:tcPr>
+          <w:p/>
+        </w:tc>
+        <w:tc>
+          <w:tcPr>
+            <w:tcW w:type="dxa" w:w="4320"/>
+          </w:tcPr>
+          <w:p/>
+        </w:tc>
+      </w:tr>
+      <w:tr>
+        <w:tc>
+          <w:tcPr>
+            <w:tcW w:type="dxa" w:w="4320"/>
+          </w:tcPr>
+          <w:p/>
+        </w:tc>
+        <w:tc>
+          <w:tcPr>
+            <w:tcW w:type="dxa" w:w="4320"/>
+          </w:tcPr>
+          <w:p/>
+        </w:tc>
+      </w:tr>
+      <w:tr>
+        <w:tc>
+          <w:tcPr>
+            <w:tcW w:type="dxa" w:w="4320"/>
+          </w:tcPr>
+          <w:p/>
+        </w:tc>
+        <w:tc>
+          <w:tcPr>
+            <w:tcW w:type="dxa" w:w="4320"/>
+          </w:tcPr>
+          <w:p/>
+        </w:tc>
+      </w:tr>
+      <w:tr>
+        <w:tc>
+          <w:tcPr>
+            <w:tcW w:type="dxa" w:w="4320"/>
+          </w:tcPr>
+          <w:p/>
+        </w:tc>
+        <w:tc>
+          <w:tcPr>
+            <w:tcW w:type="dxa" w:w="4320"/>
+          </w:tcPr>
+          <w:p/>
+        </w:tc>
+      </w:tr>
+      <w:tr>
+        <w:tc>
+          <w:tcPr>
+            <w:tcW w:type="dxa" w:w="4320"/>
+          </w:tcPr>
+          <w:p/>
+        </w:tc>
+        <w:tc>
+          <w:tcPr>
+            <w:tcW w:type="dxa" w:w="4320"/>
+          </w:tcPr>
+          <w:p/>
+        </w:tc>
+      </w:tr>
+      <w:tr>
+        <w:tc>
+          <w:tcPr>
+            <w:tcW w:type="dxa" w:w="4320"/>
+          </w:tcPr>
+          <w:p/>
+        </w:tc>
+        <w:tc>
+          <w:tcPr>
+            <w:tcW w:type="dxa" w:w="4320"/>
+          </w:tcPr>
+          <w:p/>
+        </w:tc>
+      </w:tr>
+      <w:tr>
+        <w:tc>
+          <w:tcPr>
+            <w:tcW w:type="dxa" w:w="4320"/>
+          </w:tcPr>
+          <w:p/>
+        </w:tc>
+        <w:tc>
+          <w:tcPr>
+            <w:tcW w:type="dxa" w:w="4320"/>
+          </w:tcPr>
+          <w:p/>
+        </w:tc>
+      </w:tr>
+      <w:tr>
+        <w:tc>
+          <w:tcPr>
+            <w:tcW w:type="dxa" w:w="4320"/>
+          </w:tcPr>
+          <w:p>
+            <w:r>
+              <w:t>frs_def_workflow_definition</w:t>
+            </w:r>
+          </w:p>
+        </w:tc>
+        <w:tc>
+          <w:tcPr>
+            <w:tcW w:type="dxa" w:w="4320"/>
+          </w:tcPr>
+          <w:p>
+            <w:r>
+              <w:t>Versioned workflow XML definitions</w:t>
+            </w:r>
+          </w:p>
+        </w:tc>
+      </w:tr>
+      <w:tr>
+        <w:tc>
+          <w:tcPr>
+            <w:tcW w:type="dxa" w:w="4320"/>
+          </w:tcPr>
+          <w:p>
+            <w:r>
+              <w:t>frs_def_workflow_type</w:t>
+            </w:r>
+          </w:p>
+        </w:tc>
+        <w:tc>
+          <w:tcPr>
+            <w:tcW w:type="dxa" w:w="4320"/>
+          </w:tcPr>
+          <w:p>
+            <w:r>
+              <w:t>Workflow names and types</w:t>
+            </w:r>
+          </w:p>
+        </w:tc>
+      </w:tr>
+      <w:tr>
+        <w:tc>
+          <w:tcPr>
+            <w:tcW w:type="dxa" w:w="4320"/>
+          </w:tcPr>
+          <w:p>
+            <w:r>
+              <w:t>frs_def_quick_actions</w:t>
+            </w:r>
+          </w:p>
+        </w:tc>
+        <w:tc>
+          <w:tcPr>
+            <w:tcW w:type="dxa" w:w="4320"/>
+          </w:tcPr>
+          <w:p>
+            <w:r>
+              <w:t>Quick Action JSON definitions (contains team assignments)</w:t>
+            </w:r>
+          </w:p>
+        </w:tc>
+      </w:tr>
+      <w:tr>
+        <w:tc>
+          <w:tcPr>
+            <w:tcW w:type="dxa" w:w="4320"/>
+          </w:tcPr>
+          <w:p>
+            <w:r>
+              <w:t>ServiceReqFulfillmentPlan</w:t>
+            </w:r>
+          </w:p>
+        </w:tc>
+        <w:tc>
+          <w:tcPr>
+            <w:tcW w:type="dxa" w:w="4320"/>
+          </w:tcPr>
+          <w:p>
+            <w:r>
+              <w:t>Links workflows to fulfillment plans</w:t>
+            </w:r>
+          </w:p>
+        </w:tc>
+      </w:tr>
+      <w:tr>
+        <w:tc>
+          <w:tcPr>
+            <w:tcW w:type="dxa" w:w="4320"/>
+          </w:tcPr>
+          <w:p>
+            <w:r>
+              <w:t>FusionLink</w:t>
+            </w:r>
+          </w:p>
+        </w:tc>
+        <w:tc>
+          <w:tcPr>
+            <w:tcW w:type="dxa" w:w="4320"/>
+          </w:tcPr>
+          <w:p>
+            <w:r>
+              <w:t>Relationship table linking fulfillment plans to request templates</w:t>
+            </w:r>
+          </w:p>
+        </w:tc>
+      </w:tr>
+      <w:tr>
+        <w:tc>
+          <w:tcPr>
+            <w:tcW w:type="dxa" w:w="4320"/>
+          </w:tcPr>
+          <w:p>
+            <w:r>
+              <w:t>ServiceReqTemplate</w:t>
+            </w:r>
+          </w:p>
+        </w:tc>
+        <w:tc>
+          <w:tcPr>
+            <w:tcW w:type="dxa" w:w="4320"/>
+          </w:tcPr>
+          <w:p>
+            <w:r>
+              <w:t>Request offering metadata including status</w:t>
+            </w:r>
+          </w:p>
+        </w:tc>
+      </w:tr>
+      <w:tr>
+        <w:tc>
+          <w:tcPr>
+            <w:tcW w:type="dxa" w:w="4320"/>
+          </w:tcPr>
+          <w:p>
+            <w:r>
+              <w:t>StandardUserTeam</w:t>
+            </w:r>
+          </w:p>
+        </w:tc>
+        <w:tc>
+          <w:tcPr>
+            <w:tcW w:type="dxa" w:w="4320"/>
+          </w:tcPr>
+          <w:p>
+            <w:r>
+              <w:t>Active service desk teams</w:t>
+            </w:r>
+          </w:p>
+        </w:tc>
+      </w:tr>
+    </w:tbl>
+    <w:p>
+      <w:pPr>
+        <w:pStyle w:val="Heading2"/>
+      </w:pPr>
+      <w:r>
+        <w:t>Requirements</w:t>
       </w:r>
     </w:p>
     <w:p>
@@ -2001,7 +3911,7 @@
         <w:pStyle w:val="ListBullet"/>
       </w:pPr>
       <w:r>
-        <w:t>The primary v5 script with parameter reference and output column descriptions</w:t>
+        <w:t>SQL Server 2016+ (XQuery, TRY_CAST, window functions)</w:t>
       </w:r>
     </w:p>
     <w:p>
@@ -2009,7 +3919,7 @@
         <w:pStyle w:val="ListBullet"/>
       </w:pPr>
       <w:r>
-        <w:t>Version history table for v1 through v6 with links to the v4 and v5 Word documentation files</w:t>
+        <w:t>SELECT access on all tables listed above</w:t>
       </w:r>
     </w:p>
     <w:p>
@@ -2017,31 +3927,7 @@
         <w:pStyle w:val="ListBullet"/>
       </w:pPr>
       <w:r>
-        <w:t>All supporting scripts grouped by category: search &amp; discovery, block type analysis, diagnostics &amp; troubleshooting, and schema exploration</w:t>
-      </w:r>
-    </w:p>
-    <w:p>
-      <w:pPr>
-        <w:pStyle w:val="ListBullet"/>
-      </w:pPr>
-      <w:r>
-        <w:t>The Python documentation generator scripts (generate_doc.py, generate_doc_v5.py)</w:t>
-      </w:r>
-    </w:p>
-    <w:p>
-      <w:pPr>
-        <w:pStyle w:val="ListBullet"/>
-      </w:pPr>
-      <w:r>
-        <w:t>A full table of database tables referenced and their purpose</w:t>
-      </w:r>
-    </w:p>
-    <w:p>
-      <w:pPr>
-        <w:pStyle w:val="ListBullet"/>
-      </w:pPr>
-      <w:r>
-        <w:t>SQL Server requirements and access prerequisites</w:t>
+        <w:t>tempdb write access — scripts use temp tables (#TempName) and CREATE INDEX</w:t>
       </w:r>
     </w:p>
     <w:p>

</xml_diff>